<commit_message>
fix: remove Spanish fragments from 8 EN .docx + 2 .xlsx files
- Installation_EN.docx: 3 full Spanish sentences translated
- 7 other EN .docx: minor Spanish fragments fixed
- 2 .xlsx files: Spanish headers/values translated
- All 15 EN docs now pass Spanish leak check (0 leaks)
- Added doc audit + fix scripts (7 new tools)
</commit_message>
<xml_diff>
--- a/Docs/Version 3/EN/Agents/Annexes-ConditionsLanguage_EN.docx
+++ b/Docs/Version 3/EN/Agents/Annexes-ConditionsLanguage_EN.docx
@@ -1500,11 +1500,7 @@
         </w:rPr>
       </w:pPr>
       <w:r>
-        <w:rPr>
-          <w:b/>
-          <w:bCs/>
-        </w:rPr>
-        <w:t>8. Extensiones futuras (opcional)</w:t>
+        <w:t>8. Future extensions (optional)</w:t>
       </w:r>
     </w:p>
     <w:p>

</xml_diff>